<commit_message>
Recalculate Lab 1 for k=0.5: no bold font, avoid lists, no long dashes, signed screenshots
</commit_message>
<xml_diff>
--- a/Лабораторні роботи/Лабораторна робота 01/Звіт_ЛР1_Буханцев.docx
+++ b/Лабораторні роботи/Лабораторна робота 01/Звіт_ЛР1_Буханцев.docx
@@ -4,13 +4,13 @@
   <w:body>
     <w:p>
       <w:pPr>
-        <w:spacing w:line="276" w:lineRule="auto" w:after="400"/>
+        <w:spacing w:line="276" w:lineRule="auto" w:after="480"/>
         <w:ind w:firstLine="0"/>
         <w:jc w:val="center"/>
       </w:pPr>
       <w:r>
         <w:rPr>
-          <w:b/>
+          <w:b w:val="0"/>
           <w:sz w:val="24"/>
         </w:rPr>
         <w:t>МІНІСТЕРСТВО ОСВІТИ І НАУКИ УКРАЇНИ</w:t>
@@ -28,13 +28,13 @@
     </w:p>
     <w:p>
       <w:pPr>
-        <w:spacing w:line="276" w:lineRule="auto" w:before="500" w:after="500"/>
+        <w:spacing w:line="288" w:lineRule="auto" w:before="800" w:after="800"/>
         <w:ind w:firstLine="0"/>
         <w:jc w:val="center"/>
       </w:pPr>
       <w:r>
         <w:rPr>
-          <w:b/>
+          <w:b w:val="0"/>
           <w:sz w:val="28"/>
         </w:rPr>
         <w:t>ОСВІТНІЙ КОМПОНЕНТ</w:t>
@@ -45,57 +45,43 @@
       </w:r>
       <w:r>
         <w:rPr>
-          <w:b/>
-          <w:sz w:val="44"/>
+          <w:b w:val="0"/>
+          <w:sz w:val="36"/>
         </w:rPr>
         <w:t>ЗВІТ</w:t>
         <w:br/>
       </w:r>
       <w:r>
         <w:rPr>
-          <w:b/>
-          <w:sz w:val="32"/>
+          <w:b w:val="0"/>
+          <w:sz w:val="30"/>
         </w:rPr>
-        <w:t>З ЛАБОРАТОРНОЇ РОБОТИ № 1</w:t>
-        <w:br/>
-      </w:r>
-      <w:r>
-        <w:rPr>
-          <w:sz w:val="28"/>
-        </w:rPr>
-        <w:t>Тема: «Двомірна задача лінійного програмування»</w:t>
-        <w:br/>
-      </w:r>
-      <w:r>
-        <w:rPr>
-          <w:b/>
-          <w:sz w:val="28"/>
-        </w:rPr>
-        <w:t>Варіант № 4</w:t>
+        <w:t>З ЛАБОРАТОРНОЇ РОБОТИ №1</w:t>
       </w:r>
     </w:p>
     <w:p>
       <w:pPr>
-        <w:spacing w:line="300" w:lineRule="auto" w:before="600" w:after="900"/>
+        <w:spacing w:line="300" w:lineRule="auto" w:before="1000" w:after="1400"/>
         <w:ind w:firstLine="0"/>
         <w:jc w:val="right"/>
       </w:pPr>
       <w:r>
         <w:rPr>
-          <w:sz w:val="27"/>
+          <w:b w:val="0"/>
+          <w:sz w:val="26"/>
         </w:rPr>
-        <w:t xml:space="preserve">Виконав:                </w:t>
+        <w:t>Виконав:</w:t>
         <w:br/>
-        <w:t xml:space="preserve">здобувач групи КН-24-1  </w:t>
+        <w:t>здобувач групи КН-24-1</w:t>
         <w:br/>
-        <w:t xml:space="preserve">Буханцев М. В.          </w:t>
+        <w:t>Буханцев М. В.</w:t>
         <w:br/>
         <w:br/>
-        <w:t xml:space="preserve">Перевірила:             </w:t>
+        <w:t>Перевірила:</w:t>
         <w:br/>
-        <w:t xml:space="preserve">доцент кафедри АІС      </w:t>
+        <w:t>доцент кафедри АІС</w:t>
         <w:br/>
-        <w:t xml:space="preserve">Бурдільна Є. В.         </w:t>
+        <w:t>Бурдільна Є. В.</w:t>
       </w:r>
     </w:p>
     <w:p>
@@ -106,7 +92,7 @@
       </w:pPr>
       <w:r>
         <w:rPr>
-          <w:b/>
+          <w:b w:val="0"/>
           <w:sz w:val="26"/>
         </w:rPr>
         <w:t>Кременчук 2026</w:t>
@@ -119,30 +105,14 @@
     </w:p>
     <w:p>
       <w:pPr>
-        <w:spacing w:before="120" w:after="160"/>
-        <w:ind w:firstLine="0"/>
-        <w:jc w:val="center"/>
-      </w:pPr>
-      <w:r>
-        <w:rPr>
-          <w:b/>
-          <w:sz w:val="32"/>
-        </w:rPr>
-        <w:t>Лабораторна робота № 1</w:t>
-      </w:r>
-    </w:p>
-    <w:p>
-      <w:pPr>
+        <w:spacing w:before="120" w:after="80"/>
         <w:ind w:firstLine="0"/>
       </w:pPr>
       <w:r>
         <w:rPr>
-          <w:b/>
+          <w:b w:val="0"/>
         </w:rPr>
-        <w:t xml:space="preserve">Тема: </w:t>
-      </w:r>
-      <w:r>
-        <w:t>Двомірна задача лінійного програмування.</w:t>
+        <w:t>Тема: Двомірна задача лінійного програмування.</w:t>
       </w:r>
     </w:p>
     <w:p>
@@ -152,12 +122,9 @@
       </w:pPr>
       <w:r>
         <w:rPr>
-          <w:b/>
+          <w:b w:val="0"/>
         </w:rPr>
-        <w:t xml:space="preserve">Мета: </w:t>
-      </w:r>
-      <w:r>
-        <w:t>набути навичок з розв’язування двомірних задач лінійного програмування графічним методом.</w:t>
+        <w:t>Мета: набути навичок з розв’язування двомірних задач лінійного програмування графічним методом.</w:t>
       </w:r>
     </w:p>
     <w:p>
@@ -168,22 +135,10 @@
       </w:pPr>
       <w:r>
         <w:rPr>
-          <w:b/>
-          <w:sz w:val="30"/>
+          <w:b w:val="0"/>
+          <w:sz w:val="28"/>
         </w:rPr>
         <w:t>Хід роботи</w:t>
-      </w:r>
-    </w:p>
-    <w:p>
-      <w:pPr>
-        <w:spacing w:before="120"/>
-        <w:ind w:firstLine="709"/>
-      </w:pPr>
-      <w:r>
-        <w:rPr>
-          <w:b/>
-        </w:rPr>
-        <w:t>1. Постановка задачі та вихідні дані для варіанта 4</w:t>
       </w:r>
     </w:p>
     <w:p>
@@ -192,7 +147,10 @@
         <w:jc w:val="both"/>
       </w:pPr>
       <w:r>
-        <w:t>Підприємство випускає столи двох моделей: А і В. Для випуску одного столу моделі А потрібно SA одиниці сировини та TA одиниці машинного часу. Для випуску одного столу моделі В потрібно SB одиниці сировини та TB одиниць машинного часу. Прибуток від реалізації одного столу моделі А складає WA грошові одиниці, столу моделі В – WB грошові одиниці. На підприємстві наявні 1700 одиниць сировини та 1600 одиниць машинного часу. Визначити, яким має бути план виробництва, щоб підприємство отримало максимальний прибуток.</w:t>
+        <w:rPr>
+          <w:b w:val="0"/>
+        </w:rPr>
+        <w:t>Підприємство випускає столи двох моделей: А і В. Для випуску одного столу моделі А потрібно SA одиниці сировини та TA одиниці машинного часу. Для випуску одного столу моделі В потрібно SB одиниці сировини та TB одиниць машинного часу. Прибуток від реалізації одного столу моделі А складає WA грошові одиниці, столу моделі В - WB грошові одиниці. На підприємстві наявні 1700 одиниць сировини та 1600 одиниць машинного часу. Визначити, яким має бути план виробництва, щоб підприємство отримало максимальний прибуток.</w:t>
       </w:r>
     </w:p>
     <w:p>
@@ -201,61 +159,82 @@
         <w:jc w:val="both"/>
       </w:pPr>
       <w:r>
-        <w:t>За індивідуальним завданням варіанта 4 (номер у списку N = 4, коефіцієнт підгрупи 1 k = 1):</w:t>
+        <w:rPr>
+          <w:b w:val="0"/>
+        </w:rPr>
+        <w:t>За індивідуальним завданням варіанта 4 (номер у списку N = 4, коефіцієнт підгрупи 1 k = 0.5) коефіцієнти розраховуються за формулами:</w:t>
       </w:r>
     </w:p>
     <w:p>
       <w:pPr>
         <w:spacing w:after="40"/>
-        <w:ind w:firstLine="1134"/>
+        <w:ind w:firstLine="709"/>
       </w:pPr>
       <w:r>
-        <w:t>• SA = 0.5 · N · k = 0.5 · 4 · 1 = 2.0 (од. сировини на стіл А);</w:t>
+        <w:rPr>
+          <w:b w:val="0"/>
+        </w:rPr>
+        <w:t>SA = 0.5 · N · k = 0.5 · 4 · 0.5 = 1.0 (од. сировини на стіл А);</w:t>
       </w:r>
     </w:p>
     <w:p>
       <w:pPr>
         <w:spacing w:after="40"/>
-        <w:ind w:firstLine="1134"/>
+        <w:ind w:firstLine="709"/>
       </w:pPr>
       <w:r>
-        <w:t>• TA = N / k = 4 / 1 = 4.0 (год. машинного часу на стіл А);</w:t>
+        <w:rPr>
+          <w:b w:val="0"/>
+        </w:rPr>
+        <w:t>TA = N / k = 4 / 0.5 = 8.0 (год. машинного часу на стіл А);</w:t>
       </w:r>
     </w:p>
     <w:p>
       <w:pPr>
         <w:spacing w:after="40"/>
-        <w:ind w:firstLine="1134"/>
+        <w:ind w:firstLine="709"/>
       </w:pPr>
       <w:r>
-        <w:t>• SB = N = 4.0 (од. сировини на стіл В);</w:t>
+        <w:rPr>
+          <w:b w:val="0"/>
+        </w:rPr>
+        <w:t>SB = N = 4.0 (од. сировини на стіл В);</w:t>
       </w:r>
     </w:p>
     <w:p>
       <w:pPr>
         <w:spacing w:after="40"/>
-        <w:ind w:firstLine="1134"/>
+        <w:ind w:firstLine="709"/>
       </w:pPr>
       <w:r>
-        <w:t>• TB = 0.4 · N · k = 0.4 · 4 · 1 = 1.6 (год. машинного часу на стіл В);</w:t>
+        <w:rPr>
+          <w:b w:val="0"/>
+        </w:rPr>
+        <w:t>TB = 0.4 · N · k = 0.4 · 4 · 0.5 = 0.8 (год. машинного часу на стіл В);</w:t>
       </w:r>
     </w:p>
     <w:p>
       <w:pPr>
         <w:spacing w:after="40"/>
-        <w:ind w:firstLine="1134"/>
+        <w:ind w:firstLine="709"/>
       </w:pPr>
       <w:r>
-        <w:t>• WA = N · k = 4 · 1 = 4.0 (грн прибутку від 1 столу А);</w:t>
+        <w:rPr>
+          <w:b w:val="0"/>
+        </w:rPr>
+        <w:t>WA = N · k = 4 · 0.5 = 2.0 (грн прибутку від 1 столу А);</w:t>
       </w:r>
     </w:p>
     <w:p>
       <w:pPr>
         <w:spacing w:after="40"/>
-        <w:ind w:firstLine="1134"/>
+        <w:ind w:firstLine="709"/>
       </w:pPr>
       <w:r>
-        <w:t>• WB = 1.2 · N · k = 1.2 · 4 · 1 = 4.8 (грн прибутку від 1 столу В).</w:t>
+        <w:rPr>
+          <w:b w:val="0"/>
+        </w:rPr>
+        <w:t>WB = 1.2 · N · k = 1.2 · 4 · 0.5 = 2.4 (грн прибутку від 1 столу В).</w:t>
       </w:r>
     </w:p>
     <w:p>
@@ -265,9 +244,9 @@
       </w:pPr>
       <w:r>
         <w:rPr>
-          <w:b/>
+          <w:b w:val="0"/>
         </w:rPr>
-        <w:t>Таблиця 1 – Вихідні дані задачі оптимізації виробництва (Варіант 4)</w:t>
+        <w:t>Таблиця 1 - Вихідні дані задачі оптимізації виробництва (Варіант 4)</w:t>
       </w:r>
     </w:p>
     <w:tbl>
@@ -301,7 +280,7 @@
             </w:pPr>
             <w:r>
               <w:rPr>
-                <w:b/>
+                <w:b w:val="0"/>
                 <w:sz w:val="24"/>
               </w:rPr>
               <w:t>Показник</w:t>
@@ -325,7 +304,7 @@
             </w:pPr>
             <w:r>
               <w:rPr>
-                <w:b/>
+                <w:b w:val="0"/>
                 <w:sz w:val="24"/>
               </w:rPr>
               <w:t>Стіл моделі А (x1)</w:t>
@@ -349,7 +328,7 @@
             </w:pPr>
             <w:r>
               <w:rPr>
-                <w:b/>
+                <w:b w:val="0"/>
                 <w:sz w:val="24"/>
               </w:rPr>
               <w:t>Стіл моделі В (x2)</w:t>
@@ -373,7 +352,7 @@
             </w:pPr>
             <w:r>
               <w:rPr>
-                <w:b/>
+                <w:b w:val="0"/>
                 <w:sz w:val="24"/>
               </w:rPr>
               <w:t>Наявний запас на складі</w:t>
@@ -398,6 +377,7 @@
             </w:pPr>
             <w:r>
               <w:rPr>
+                <w:b w:val="0"/>
                 <w:sz w:val="24"/>
               </w:rPr>
               <w:t>Витрати сировини на виріб, од.</w:t>
@@ -420,9 +400,10 @@
             </w:pPr>
             <w:r>
               <w:rPr>
+                <w:b w:val="0"/>
                 <w:sz w:val="24"/>
               </w:rPr>
-              <w:t>2.0</w:t>
+              <w:t>1.0</w:t>
             </w:r>
           </w:p>
         </w:tc>
@@ -442,6 +423,7 @@
             </w:pPr>
             <w:r>
               <w:rPr>
+                <w:b w:val="0"/>
                 <w:sz w:val="24"/>
               </w:rPr>
               <w:t>4.0</w:t>
@@ -464,6 +446,7 @@
             </w:pPr>
             <w:r>
               <w:rPr>
+                <w:b w:val="0"/>
                 <w:sz w:val="24"/>
               </w:rPr>
               <w:t>1700 од.</w:t>
@@ -488,6 +471,7 @@
             </w:pPr>
             <w:r>
               <w:rPr>
+                <w:b w:val="0"/>
                 <w:sz w:val="24"/>
               </w:rPr>
               <w:t>Витрати машинного часу, год.</w:t>
@@ -510,9 +494,10 @@
             </w:pPr>
             <w:r>
               <w:rPr>
+                <w:b w:val="0"/>
                 <w:sz w:val="24"/>
               </w:rPr>
-              <w:t>4.0</w:t>
+              <w:t>8.0</w:t>
             </w:r>
           </w:p>
         </w:tc>
@@ -532,9 +517,10 @@
             </w:pPr>
             <w:r>
               <w:rPr>
+                <w:b w:val="0"/>
                 <w:sz w:val="24"/>
               </w:rPr>
-              <w:t>1.6</w:t>
+              <w:t>0.8</w:t>
             </w:r>
           </w:p>
         </w:tc>
@@ -554,6 +540,7 @@
             </w:pPr>
             <w:r>
               <w:rPr>
+                <w:b w:val="0"/>
                 <w:sz w:val="24"/>
               </w:rPr>
               <w:t>1600 год.</w:t>
@@ -578,6 +565,7 @@
             </w:pPr>
             <w:r>
               <w:rPr>
+                <w:b w:val="0"/>
                 <w:sz w:val="24"/>
               </w:rPr>
               <w:t>Прибуток від реалізації виробу, грош. од.</w:t>
@@ -600,9 +588,10 @@
             </w:pPr>
             <w:r>
               <w:rPr>
+                <w:b w:val="0"/>
                 <w:sz w:val="24"/>
               </w:rPr>
-              <w:t>4.0</w:t>
+              <w:t>2.0</w:t>
             </w:r>
           </w:p>
         </w:tc>
@@ -622,9 +611,10 @@
             </w:pPr>
             <w:r>
               <w:rPr>
+                <w:b w:val="0"/>
                 <w:sz w:val="24"/>
               </w:rPr>
-              <w:t>4.8</w:t>
+              <w:t>2.4</w:t>
             </w:r>
           </w:p>
         </w:tc>
@@ -644,9 +634,10 @@
             </w:pPr>
             <w:r>
               <w:rPr>
+                <w:b w:val="0"/>
                 <w:sz w:val="24"/>
               </w:rPr>
-              <w:t>—</w:t>
+              <w:t>-</w:t>
             </w:r>
           </w:p>
         </w:tc>
@@ -659,7 +650,7 @@
       </w:pPr>
       <w:r>
         <w:rPr>
-          <w:b/>
+          <w:b w:val="0"/>
         </w:rPr>
         <w:t>2. Економіко-математична модель ЗЛП</w:t>
       </w:r>
@@ -670,7 +661,10 @@
         <w:jc w:val="both"/>
       </w:pPr>
       <w:r>
-        <w:t>Нехай x1 — щоденний обсяг випуску столів моделі А (шт.), а x2 — моделі В (шт.).</w:t>
+        <w:rPr>
+          <w:b w:val="0"/>
+        </w:rPr>
+        <w:t>Нехай x1 - щоденний обсяг випуску столів моделі А (шт.), а x2 - щоденний обсяг випуску столів моделі В (шт.).</w:t>
       </w:r>
     </w:p>
     <w:p>
@@ -679,7 +673,7 @@
       </w:pPr>
       <w:r>
         <w:rPr>
-          <w:b/>
+          <w:b w:val="0"/>
         </w:rPr>
         <w:t>Цільова функція (критерій ефективності):</w:t>
       </w:r>
@@ -691,10 +685,10 @@
       </w:pPr>
       <w:r>
         <w:rPr>
-          <w:b/>
+          <w:b w:val="0"/>
           <w:sz w:val="28"/>
         </w:rPr>
-        <w:t>W(x1, x2) = 4.0 · x1 + 4.8 · x2 → max</w:t>
+        <w:t>W(x1, x2) = 2.0 · x1 + 2.4 · x2 → max</w:t>
       </w:r>
     </w:p>
     <w:p>
@@ -703,7 +697,7 @@
       </w:pPr>
       <w:r>
         <w:rPr>
-          <w:b/>
+          <w:b w:val="0"/>
         </w:rPr>
         <w:t>Система обмежень за виробничими ресурсами:</w:t>
       </w:r>
@@ -714,9 +708,12 @@
         <w:jc w:val="center"/>
       </w:pPr>
       <w:r>
-        <w:t>2.0 · x1 + 4.0 · x2 ≤ 1700  (обмеження за сировиною)</w:t>
+        <w:rPr>
+          <w:b w:val="0"/>
+        </w:rPr>
+        <w:t>1.0 · x1 + 4.0 · x2 ≤ 1700  (обмеження за сировиною)</w:t>
         <w:br/>
-        <w:t>4.0 · x1 + 1.6 · x2 ≤ 1600  (обмеження за машинним часом)</w:t>
+        <w:t>8.0 · x1 + 0.8 · x2 ≤ 1600  (обмеження за машинним часом)</w:t>
       </w:r>
     </w:p>
     <w:p>
@@ -725,7 +722,7 @@
       </w:pPr>
       <w:r>
         <w:rPr>
-          <w:b/>
+          <w:b w:val="0"/>
         </w:rPr>
         <w:t>Граничні умови невід'ємності змінних:</w:t>
       </w:r>
@@ -736,6 +733,9 @@
         <w:jc w:val="center"/>
       </w:pPr>
       <w:r>
+        <w:rPr>
+          <w:b w:val="0"/>
+        </w:rPr>
         <w:t>x1 ≥ 0,   x2 ≥ 0</w:t>
       </w:r>
     </w:p>
@@ -746,7 +746,7 @@
       </w:pPr>
       <w:r>
         <w:rPr>
-          <w:b/>
+          <w:b w:val="0"/>
         </w:rPr>
         <w:t>3. Графічний розв'язок ЗЛП</w:t>
       </w:r>
@@ -757,11 +757,14 @@
         <w:jc w:val="both"/>
       </w:pPr>
       <w:r>
+        <w:rPr>
+          <w:b w:val="0"/>
+        </w:rPr>
         <w:t>Перетворимо нерівності обмежень у рівності граничних прямих:</w:t>
         <w:br/>
-        <w:t>1. Пряма L1 (сировина): 2 x1 + 4 x2 = 1700  ⇒  x2 = 425 - 0.5 x1. Точки перетину з осями координат: (0; 425) та (850; 0).</w:t>
+        <w:t>1. Пряма L1 (сировина): 1.0 x1 + 4.0 x2 = 1700 ⇒ x2 = 425 - 0.25 x1. Точки перетину з осями координат: (0; 425) та (1700; 0).</w:t>
         <w:br/>
-        <w:t>2. Пряма L2 (час): 4 x1 + 1.6 x2 = 1600  ⇒  x2 = 1000 - 2.5 x1. Точки перетину з осями координат: (0; 1000) та (400; 0).</w:t>
+        <w:t>2. Пряма L2 (час): 8.0 x1 + 0.8 x2 = 1600 ⇒ x2 = 2000 - 10 x1. Точки перетину з осями координат: (0; 2000) та (200; 0).</w:t>
       </w:r>
     </w:p>
     <w:p>
@@ -770,15 +773,10 @@
         <w:jc w:val="both"/>
       </w:pPr>
       <w:r>
-        <w:t>Перетин півплощин у першому координатному квадранті утворює область допустимих розв'язків (ОДР) у вигляді опуклого замкненого чотирикутника OABC з вершинами:</w:t>
-        <w:br/>
-        <w:t>• O(0; 0) — початок координат;</w:t>
-        <w:br/>
-        <w:t>• A(400; 0) — точка перетину прямої L2 з віссю Ox1;</w:t>
-        <w:br/>
-        <w:t>• B(x1*; x2*) — точка взаємного перетину прямих обмежень L1 та L2;</w:t>
-        <w:br/>
-        <w:t>• C(0; 425) — точка перетину прямої L1 з віссю Ox2.</w:t>
+        <w:rPr>
+          <w:b w:val="0"/>
+        </w:rPr>
+        <w:t>Перетин півплощин у першому координатному квадранті утворює область допустимих розв'язків (ОДР) у вигляді опуклого замкненого чотирикутника OABC з вершинами: вершина O(0; 0) - початок координат; вершина A(200; 0) - точка перетину прямої L2 з віссю Ox1; вершина B(x1*; x2*) - точка взаємного перетину прямих обмежень L1 та L2; вершина C(0; 425) - точка перетину прямої L1 з віссю Ox2.</w:t>
       </w:r>
     </w:p>
     <w:p>
@@ -787,15 +785,18 @@
         <w:jc w:val="both"/>
       </w:pPr>
       <w:r>
+        <w:rPr>
+          <w:b w:val="0"/>
+        </w:rPr>
         <w:t>Знайдемо аналітично координати вершини B розв'язанням системи лінійних рівнянь:</w:t>
         <w:br/>
-        <w:t xml:space="preserve">   2 x1 + 4 x2 = 1700</w:t>
+        <w:t xml:space="preserve">   1.0 x1 + 4.0 x2 = 1700</w:t>
         <w:br/>
-        <w:t xml:space="preserve">   4 x1 + 1.6 x2 = 1600</w:t>
+        <w:t xml:space="preserve">   8.0 x1 + 0.8 x2 = 1600</w:t>
         <w:br/>
-        <w:t>Помноживши перше рівняння на 2 та віднявши друге, отримуємо: 6.4 x2 = 1800 ⇒ x2* = 281.25.</w:t>
+        <w:t>Помноживши перше рівняння на 8 та віднявши друге, отримуємо: 31.2 x2 = 12000 ⇒ x2* = 5000 / 13 ≈ 384.62.</w:t>
         <w:br/>
-        <w:t>Підставивши у перше рівняння, маємо: 2 x1 = 1700 - 4(281.25) = 575 ⇒ x1* = 287.5.</w:t>
+        <w:t>Підставивши у перше рівняння, маємо: 1.0 x1 = 1700 - 4(384.615) = 2100 / 13 ≈ 161.54.</w:t>
       </w:r>
     </w:p>
     <w:p>
@@ -804,7 +805,10 @@
         <w:jc w:val="both"/>
       </w:pPr>
       <w:r>
-        <w:t>Вектор градієнта цільової функції: c⃗ = ∇W = (4.0; 4.8). Він перпендикулярний до ліній рівня 4 x1 + 4.8 x2 = const. Переміщуючи лінію рівня у напрямку градієнта від початку координат, встановлюємо, що крайньою точкою виходу лінії рівня з багатокутника ОДР є вершина B(287.5; 281.25).</w:t>
+        <w:rPr>
+          <w:b w:val="0"/>
+        </w:rPr>
+        <w:t>Вектор градієнта цільової функції: c = grad W = (2.0; 2.4). Він перпендикулярний до ліній рівня 2.0 x1 + 2.4 x2 = const. Переміщуючи лінію рівня у напрямку градієнта від початку координат, встановлюємо, що крайньою точкою виходу лінії рівня з багатокутника ОДР є вершина B(161.54; 384.62).</w:t>
       </w:r>
     </w:p>
     <w:p>
@@ -858,10 +862,10 @@
       </w:pPr>
       <w:r>
         <w:rPr>
-          <w:b/>
+          <w:b w:val="0"/>
           <w:sz w:val="24"/>
         </w:rPr>
-        <w:t>Рисунок 1 – Графічне розв’язання задачі лінійного програмування (Варіант 4)</w:t>
+        <w:t>Рисунок 1 - Графічне розв'язання задачі лінійного програмування (Варіант 4)</w:t>
       </w:r>
     </w:p>
     <w:p>
@@ -871,45 +875,9 @@
       </w:pPr>
       <w:r>
         <w:rPr>
-          <w:b/>
+          <w:b w:val="0"/>
         </w:rPr>
         <w:t>4. Розрахунок цільової функції у кутових точках ОДР</w:t>
-      </w:r>
-    </w:p>
-    <w:p>
-      <w:pPr>
-        <w:spacing w:after="40"/>
-        <w:ind w:firstLine="1134"/>
-      </w:pPr>
-      <w:r>
-        <w:t>• W(O) = 4(0) + 4.8(0) = 0 грош. од.;</w:t>
-      </w:r>
-    </w:p>
-    <w:p>
-      <w:pPr>
-        <w:spacing w:after="40"/>
-        <w:ind w:firstLine="1134"/>
-      </w:pPr>
-      <w:r>
-        <w:t>• W(A) = 4(400) + 4.8(0) = 1600 грош. од.;</w:t>
-      </w:r>
-    </w:p>
-    <w:p>
-      <w:pPr>
-        <w:spacing w:after="40"/>
-        <w:ind w:firstLine="1134"/>
-      </w:pPr>
-      <w:r>
-        <w:t>• W(C) = 4(0) + 4.8(425) = 2040 грош. од.;</w:t>
-      </w:r>
-    </w:p>
-    <w:p>
-      <w:pPr>
-        <w:spacing w:after="40"/>
-        <w:ind w:firstLine="1134"/>
-      </w:pPr>
-      <w:r>
-        <w:t>• W(B) = 4(287.5) + 4.8(281.25) = 1150 + 1350 = 2500.00 грош. од.</w:t>
       </w:r>
     </w:p>
     <w:p>
@@ -917,13 +885,69 @@
         <w:ind w:firstLine="709"/>
       </w:pPr>
       <w:r>
-        <w:t xml:space="preserve">Отже, максимальний прибуток досягається у точці B і становить </w:t>
+        <w:rPr>
+          <w:b w:val="0"/>
+        </w:rPr>
+        <w:t>Значення цільової функції у кутових вершинах багатокутника рішень становлять:</w:t>
       </w:r>
+    </w:p>
+    <w:p>
+      <w:pPr>
+        <w:spacing w:after="40"/>
+        <w:ind w:firstLine="709"/>
+      </w:pPr>
       <w:r>
         <w:rPr>
-          <w:b/>
+          <w:b w:val="0"/>
         </w:rPr>
-        <w:t>W_max = 2500.00 грн.</w:t>
+        <w:t>W(O) = 2.0 · 0 + 2.4 · 0 = 0.00 грош. од.;</w:t>
+      </w:r>
+    </w:p>
+    <w:p>
+      <w:pPr>
+        <w:spacing w:after="40"/>
+        <w:ind w:firstLine="709"/>
+      </w:pPr>
+      <w:r>
+        <w:rPr>
+          <w:b w:val="0"/>
+        </w:rPr>
+        <w:t>W(A) = 2.0 · 200 + 2.4 · 0 = 400.00 грош. од.;</w:t>
+      </w:r>
+    </w:p>
+    <w:p>
+      <w:pPr>
+        <w:spacing w:after="40"/>
+        <w:ind w:firstLine="709"/>
+      </w:pPr>
+      <w:r>
+        <w:rPr>
+          <w:b w:val="0"/>
+        </w:rPr>
+        <w:t>W(C) = 2.0 · 0 + 2.4 · 425 = 1020.00 грош. од.;</w:t>
+      </w:r>
+    </w:p>
+    <w:p>
+      <w:pPr>
+        <w:spacing w:after="40"/>
+        <w:ind w:firstLine="709"/>
+      </w:pPr>
+      <w:r>
+        <w:rPr>
+          <w:b w:val="0"/>
+        </w:rPr>
+        <w:t>W(B) = 2.0 · 161.54 + 2.4 · 384.62 = 323.08 + 923.08 = 1246.15 грош. од.</w:t>
+      </w:r>
+    </w:p>
+    <w:p>
+      <w:pPr>
+        <w:ind w:firstLine="709"/>
+      </w:pPr>
+      <w:r>
+        <w:rPr>
+          <w:b w:val="0"/>
+        </w:rPr>
+        <w:t>Отже, максимальний прибуток досягається у точці B і становить W_max = 1246.15 грн.</w:t>
       </w:r>
     </w:p>
     <w:p>
@@ -933,7 +957,7 @@
       </w:pPr>
       <w:r>
         <w:rPr>
-          <w:b/>
+          <w:b w:val="0"/>
         </w:rPr>
         <w:t>5. Обчислення залишків ресурсів на складах</w:t>
       </w:r>
@@ -944,11 +968,14 @@
         <w:jc w:val="both"/>
       </w:pPr>
       <w:r>
-        <w:t>Підставимо отримані оптимальні значення x1* = 287.5 та x2* = 281.25 у ліві частини рівнянь обмежень:</w:t>
+        <w:rPr>
+          <w:b w:val="0"/>
+        </w:rPr>
+        <w:t>Підставимо отримані оптимальні значення x1* = 161.54 та x2* = 384.62 у ліві частини обмежень:</w:t>
         <w:br/>
-        <w:t>• Використання сировини: 2 · 287.5 + 4 · 281.25 = 1700 од. Залишок: 1700 - 1700 = 0 од. (100% використання);</w:t>
+        <w:t>Використання сировини: 1.0 · 161.54 + 4.0 · 384.62 = 1700.0 од. Залишок: 1700 - 1700 = 0.0 од. (100% використання).</w:t>
         <w:br/>
-        <w:t>• Використання машинного часу: 4 · 287.5 + 1.6 · 281.25 = 1600 год. Залишок: 1600 - 1600 = 0 год. (100% використання).</w:t>
+        <w:t>Використання машинного часу: 8.0 · 161.54 + 0.8 · 384.62 = 1600.0 год. Залишок: 1600 - 1600 = 0.0 год. (100% використання).</w:t>
         <w:br/>
         <w:t>Висновок: обидва ресурси є повністю вичерпаними (дефіцитними), резервів немає.</w:t>
       </w:r>
@@ -960,7 +987,7 @@
       </w:pPr>
       <w:r>
         <w:rPr>
-          <w:b/>
+          <w:b w:val="0"/>
         </w:rPr>
         <w:t>6. Цілочисельний аналіз для неподільних виробів</w:t>
       </w:r>
@@ -971,7 +998,10 @@
         <w:jc w:val="both"/>
       </w:pPr>
       <w:r>
-        <w:t>Оскільки столи є фізично неподільною продукцією (x1, x2 ∈ ℤ), проведено аналіз цілочисельних вузлів сітки в околі вершини B(287.5; 281.25) з перевіркою виконання обмежень.</w:t>
+        <w:rPr>
+          <w:b w:val="0"/>
+        </w:rPr>
+        <w:t>Оскільки столи є фізично неподільною продукцією (x1, x2 належать множині цілих чисел Z), проведено аналіз цілочисельних вузлів сітки в околі вершини B(161.54; 384.62) з перевіркою виконання обмежень.</w:t>
       </w:r>
     </w:p>
     <w:p>
@@ -1025,10 +1055,10 @@
       </w:pPr>
       <w:r>
         <w:rPr>
-          <w:b/>
+          <w:b w:val="0"/>
           <w:sz w:val="24"/>
         </w:rPr>
-        <w:t>Рисунок 2 – Деталізований окіл точки оптимуму та цілочисельний аналіз</w:t>
+        <w:t>Рисунок 2 - Деталізований окіл точки оптимуму та цілочисельний аналіз</w:t>
       </w:r>
     </w:p>
     <w:p>
@@ -1037,15 +1067,18 @@
         <w:jc w:val="both"/>
       </w:pPr>
       <w:r>
-        <w:t>Серед усіх допустимих цілочисельних планів найкращим є план (286; 282):</w:t>
+        <w:rPr>
+          <w:b w:val="0"/>
+        </w:rPr>
+        <w:t>Серед усіх допустимих цілочисельних планів найкращим є план (160; 385):</w:t>
         <w:br/>
-        <w:t>• Випуск: 286 столів моделі А та 282 столи моделі В;</w:t>
+        <w:t>Випуск: 160 столів моделі А та 385 столів моделі В;</w:t>
         <w:br/>
-        <w:t>• Прибуток: W = 4(286) + 4.8(282) = 2497.60 грн;</w:t>
+        <w:t>Прибуток: W = 2.0(160) + 2.4(385) = 320 + 924 = 1244.00 грн;</w:t>
         <w:br/>
-        <w:t>• Використання сировини: 2(286) + 4(282) = 1700 од. (залишок 0 од., 100% завантаження);</w:t>
+        <w:t>Використання сировини: 1.0(160) + 4.0(385) = 1700 од. (залишок 0 од., 100% завантаження);</w:t>
         <w:br/>
-        <w:t>• Використання часу: 4(286) + 1.6(282) = 1595.2 год. (залишок 4.8 год., завантаження 99.7%).</w:t>
+        <w:t>Використання часу: 8.0(160) + 0.8(385) = 1588.0 год. (залишок 12.0 год., завантаження 99.25%).</w:t>
       </w:r>
     </w:p>
     <w:p>
@@ -1055,7 +1088,7 @@
       </w:pPr>
       <w:r>
         <w:rPr>
-          <w:b/>
+          <w:b w:val="0"/>
         </w:rPr>
         <w:t>7. Зведена таблиця результатів та рекомендації виробництву</w:t>
       </w:r>
@@ -1111,10 +1144,10 @@
       </w:pPr>
       <w:r>
         <w:rPr>
-          <w:b/>
+          <w:b w:val="0"/>
           <w:sz w:val="24"/>
         </w:rPr>
-        <w:t>Рисунок 3 – Зведені показники розв’язку оптимізаційної задачі</w:t>
+        <w:t>Рисунок 3 - Зведені показники розв'язку оптимізаційної задачі</w:t>
       </w:r>
     </w:p>
     <w:p>
@@ -1124,9 +1157,9 @@
       </w:pPr>
       <w:r>
         <w:rPr>
-          <w:b/>
+          <w:b w:val="0"/>
         </w:rPr>
-        <w:t>Таблиця 2 – Порівняльний аналіз отриманих планів виробництва</w:t>
+        <w:t>Таблиця 2 - Порівняльний аналіз отриманих планів виробництва</w:t>
       </w:r>
     </w:p>
     <w:tbl>
@@ -1159,7 +1192,7 @@
             </w:pPr>
             <w:r>
               <w:rPr>
-                <w:b/>
+                <w:b w:val="0"/>
                 <w:sz w:val="24"/>
               </w:rPr>
               <w:t>Показник</w:t>
@@ -1183,7 +1216,7 @@
             </w:pPr>
             <w:r>
               <w:rPr>
-                <w:b/>
+                <w:b w:val="0"/>
                 <w:sz w:val="24"/>
               </w:rPr>
               <w:t>Неперервний розв'язок (x*)</w:t>
@@ -1207,7 +1240,7 @@
             </w:pPr>
             <w:r>
               <w:rPr>
-                <w:b/>
+                <w:b w:val="0"/>
                 <w:sz w:val="24"/>
               </w:rPr>
               <w:t>Практичний цілочисельний план</w:t>
@@ -1232,6 +1265,7 @@
             </w:pPr>
             <w:r>
               <w:rPr>
+                <w:b w:val="0"/>
                 <w:sz w:val="24"/>
               </w:rPr>
               <w:t>Столи моделі А (x1), шт.</w:t>
@@ -1254,9 +1288,10 @@
             </w:pPr>
             <w:r>
               <w:rPr>
+                <w:b w:val="0"/>
                 <w:sz w:val="24"/>
               </w:rPr>
-              <w:t>287.50</w:t>
+              <w:t>161.54</w:t>
             </w:r>
           </w:p>
         </w:tc>
@@ -1276,9 +1311,10 @@
             </w:pPr>
             <w:r>
               <w:rPr>
+                <w:b w:val="0"/>
                 <w:sz w:val="24"/>
               </w:rPr>
-              <w:t>286</w:t>
+              <w:t>160</w:t>
             </w:r>
           </w:p>
         </w:tc>
@@ -1300,6 +1336,7 @@
             </w:pPr>
             <w:r>
               <w:rPr>
+                <w:b w:val="0"/>
                 <w:sz w:val="24"/>
               </w:rPr>
               <w:t>Столи моделі В (x2), шт.</w:t>
@@ -1322,9 +1359,10 @@
             </w:pPr>
             <w:r>
               <w:rPr>
+                <w:b w:val="0"/>
                 <w:sz w:val="24"/>
               </w:rPr>
-              <w:t>281.25</w:t>
+              <w:t>384.62</w:t>
             </w:r>
           </w:p>
         </w:tc>
@@ -1344,9 +1382,10 @@
             </w:pPr>
             <w:r>
               <w:rPr>
+                <w:b w:val="0"/>
                 <w:sz w:val="24"/>
               </w:rPr>
-              <w:t>282</w:t>
+              <w:t>385</w:t>
             </w:r>
           </w:p>
         </w:tc>
@@ -1368,7 +1407,7 @@
             </w:pPr>
             <w:r>
               <w:rPr>
-                <w:b/>
+                <w:b w:val="0"/>
                 <w:sz w:val="24"/>
               </w:rPr>
               <w:t>Максимальний прибуток (W), грн</w:t>
@@ -1391,10 +1430,10 @@
             </w:pPr>
             <w:r>
               <w:rPr>
-                <w:b/>
+                <w:b w:val="0"/>
                 <w:sz w:val="24"/>
               </w:rPr>
-              <w:t>2500.00</w:t>
+              <w:t>1246.15</w:t>
             </w:r>
           </w:p>
         </w:tc>
@@ -1414,10 +1453,10 @@
             </w:pPr>
             <w:r>
               <w:rPr>
-                <w:b/>
+                <w:b w:val="0"/>
                 <w:sz w:val="24"/>
               </w:rPr>
-              <w:t>2497.60</w:t>
+              <w:t>1244.00</w:t>
             </w:r>
           </w:p>
         </w:tc>
@@ -1439,6 +1478,7 @@
             </w:pPr>
             <w:r>
               <w:rPr>
+                <w:b w:val="0"/>
                 <w:sz w:val="24"/>
               </w:rPr>
               <w:t>Використання сировини</w:t>
@@ -1461,6 +1501,7 @@
             </w:pPr>
             <w:r>
               <w:rPr>
+                <w:b w:val="0"/>
                 <w:sz w:val="24"/>
               </w:rPr>
               <w:t>1700 / 1700 од. (100%)</w:t>
@@ -1483,6 +1524,7 @@
             </w:pPr>
             <w:r>
               <w:rPr>
+                <w:b w:val="0"/>
                 <w:sz w:val="24"/>
               </w:rPr>
               <w:t>1700 / 1700 од. (100%)</w:t>
@@ -1507,6 +1549,7 @@
             </w:pPr>
             <w:r>
               <w:rPr>
+                <w:b w:val="0"/>
                 <w:sz w:val="24"/>
               </w:rPr>
               <w:t>Залишок сировини</w:t>
@@ -1529,6 +1572,7 @@
             </w:pPr>
             <w:r>
               <w:rPr>
+                <w:b w:val="0"/>
                 <w:sz w:val="24"/>
               </w:rPr>
               <w:t>0.0 од.</w:t>
@@ -1551,6 +1595,7 @@
             </w:pPr>
             <w:r>
               <w:rPr>
+                <w:b w:val="0"/>
                 <w:sz w:val="24"/>
               </w:rPr>
               <w:t>0.0 од.</w:t>
@@ -1575,6 +1620,7 @@
             </w:pPr>
             <w:r>
               <w:rPr>
+                <w:b w:val="0"/>
                 <w:sz w:val="24"/>
               </w:rPr>
               <w:t>Використання машинного часу</w:t>
@@ -1597,6 +1643,7 @@
             </w:pPr>
             <w:r>
               <w:rPr>
+                <w:b w:val="0"/>
                 <w:sz w:val="24"/>
               </w:rPr>
               <w:t>1600 / 1600 год. (100%)</w:t>
@@ -1619,9 +1666,10 @@
             </w:pPr>
             <w:r>
               <w:rPr>
+                <w:b w:val="0"/>
                 <w:sz w:val="24"/>
               </w:rPr>
-              <w:t>1595.2 / 1600 год. (99.7%)</w:t>
+              <w:t>1588.0 / 1600 год. (99.25%)</w:t>
             </w:r>
           </w:p>
         </w:tc>
@@ -1643,6 +1691,7 @@
             </w:pPr>
             <w:r>
               <w:rPr>
+                <w:b w:val="0"/>
                 <w:sz w:val="24"/>
               </w:rPr>
               <w:t>Залишок машинного часу</w:t>
@@ -1665,6 +1714,7 @@
             </w:pPr>
             <w:r>
               <w:rPr>
+                <w:b w:val="0"/>
                 <w:sz w:val="24"/>
               </w:rPr>
               <w:t>0.0 год.</w:t>
@@ -1687,9 +1737,10 @@
             </w:pPr>
             <w:r>
               <w:rPr>
+                <w:b w:val="0"/>
                 <w:sz w:val="24"/>
               </w:rPr>
-              <w:t>4.8 год.</w:t>
+              <w:t>12.0 год.</w:t>
             </w:r>
           </w:p>
         </w:tc>
@@ -1702,9 +1753,12 @@
         <w:jc w:val="both"/>
       </w:pPr>
       <w:r>
+        <w:rPr>
+          <w:b w:val="0"/>
+        </w:rPr>
         <w:t>Рекомендації щодо оптимізації виробництва:</w:t>
         <w:br/>
-        <w:t>Оскільки ресурси сировини та машинного часу вичерпані повністю, подальше зростання прибутку можливе виключно шляхом залучення додаткових обсягів сировини та нарощування фонду обладнання. У практичній діяльності рекомендується затвердити щоденний план випуску: 286 столів моделі А та 282 столів моделі В, що забезпечує 2497.60 грн чистого прибутку.</w:t>
+        <w:t>Оскільки ресурс сировини вичерпаний на 100%, а машинний час задіяний на 99.25%, підприємству слід затвердити щоденний виробничий план у розмірі 160 столів моделі А та 385 столів моделі В. Це забезпечує отримання максимального практичного прибутку у сумі 1244.00 грн за мінімального недовантаження обладнання (лише 12 годин за зміну). Подальше збільшення прибутку можливе виключно за умови додаткового постачання сировини.</w:t>
       </w:r>
     </w:p>
     <w:p>
@@ -1714,7 +1768,7 @@
       </w:pPr>
       <w:r>
         <w:rPr>
-          <w:b/>
+          <w:b w:val="0"/>
         </w:rPr>
         <w:t>8. Програмна реалізація мовою Python (лістинг розрахунку)</w:t>
       </w:r>
@@ -1727,6 +1781,7 @@
       <w:r>
         <w:rPr>
           <w:rFonts w:ascii="Consolas" w:hAnsi="Consolas"/>
+          <w:b w:val="0"/>
           <w:sz w:val="19"/>
         </w:rPr>
         <w:t>import numpy as np</w:t>
@@ -1734,11 +1789,11 @@
         <w:t>from scipy.optimize import linprog</w:t>
         <w:br/>
         <w:br/>
-        <w:t>N, k = 4, 1</w:t>
+        <w:t>N, k = 4, 0.5</w:t>
         <w:br/>
-        <w:t>S_A, T_A, W_A = 0.5 * N * k, N / k, N * k             # 2.0, 4.0, 4.0</w:t>
+        <w:t>S_A, T_A, W_A = 0.5 * N * k, N / k, N * k             # 1.0, 8.0, 2.0</w:t>
         <w:br/>
-        <w:t>S_B, T_B, W_B = float(N), 0.4 * N * k, 1.2 * N * k       # 4.0, 1.6, 4.8</w:t>
+        <w:t>S_B, T_B, W_B = float(N), 0.4 * N * k, 1.2 * N * k       # 4.0, 0.8, 2.4</w:t>
         <w:br/>
         <w:t>LIMIT_RAW, LIMIT_TIME = 1700.0, 1600.0</w:t>
         <w:br/>
@@ -1771,7 +1826,7 @@
       </w:pPr>
       <w:r>
         <w:rPr>
-          <w:b/>
+          <w:b w:val="0"/>
         </w:rPr>
         <w:t>9. Відповіді на контрольні питання</w:t>
       </w:r>
@@ -1784,11 +1839,14 @@
       </w:pPr>
       <w:r>
         <w:rPr>
-          <w:b/>
+          <w:b w:val="0"/>
         </w:rPr>
         <w:t xml:space="preserve">1. Які задачі називають задачами лінійного програмування? </w:t>
       </w:r>
       <w:r>
+        <w:rPr>
+          <w:b w:val="0"/>
+        </w:rPr>
         <w:t>Оптимізаційні задачі, в яких цільова функція є лінійною, а множина допустимих розв'язків задана системою лінійних рівностей або нерівностей.</w:t>
       </w:r>
     </w:p>
@@ -1800,11 +1858,14 @@
       </w:pPr>
       <w:r>
         <w:rPr>
-          <w:b/>
+          <w:b w:val="0"/>
         </w:rPr>
         <w:t xml:space="preserve">2. Що таке цільова функція? </w:t>
       </w:r>
       <w:r>
+        <w:rPr>
+          <w:b w:val="0"/>
+        </w:rPr>
         <w:t>Функція залежності оптимізованого критерію (прибутку, собівартості) від керованих змінних, екстремальне значення якої є метою дослідження.</w:t>
       </w:r>
     </w:p>
@@ -1816,12 +1877,15 @@
       </w:pPr>
       <w:r>
         <w:rPr>
-          <w:b/>
+          <w:b w:val="0"/>
         </w:rPr>
         <w:t xml:space="preserve">3. Як записуються рівняння обмеження? </w:t>
       </w:r>
       <w:r>
-        <w:t>У вигляді алгебраїчних нерівностей або рівнянь ∑ c_ij · x_j ≤ S_i, де c_ij — питомі норми витрат, а S_i — наявний запас ресурсу.</w:t>
+        <w:rPr>
+          <w:b w:val="0"/>
+        </w:rPr>
+        <w:t>У вигляді алгебраїчних нерівностей або рівнянь sum(c_ij * x_j) &lt;= S_i, де c_ij - питомі норми витрат, а S_i - наявний запас ресурсу.</w:t>
       </w:r>
     </w:p>
     <w:p>
@@ -1832,12 +1896,15 @@
       </w:pPr>
       <w:r>
         <w:rPr>
-          <w:b/>
+          <w:b w:val="0"/>
         </w:rPr>
-        <w:t xml:space="preserve">4. Які обмеження обов’язково застосовуються до задач оптимального виробництва? </w:t>
+        <w:t xml:space="preserve">4. Які обмеження обов'язково застосовуються до задач оптимального виробництва? </w:t>
       </w:r>
       <w:r>
-        <w:t>Обмеження за обсягами виробничих ресурсів, умови невід'ємності x_j ≥ 0 та вимоги цілочисельності змінних для неподільної продукції.</w:t>
+        <w:rPr>
+          <w:b w:val="0"/>
+        </w:rPr>
+        <w:t>Обмеження за обсягами виробничих ресурсів, умови невід'ємності x_j &gt;= 0 та вимоги цілочисельності змінних для неподільної продукції.</w:t>
       </w:r>
     </w:p>
     <w:p>
@@ -1848,11 +1915,14 @@
       </w:pPr>
       <w:r>
         <w:rPr>
-          <w:b/>
+          <w:b w:val="0"/>
         </w:rPr>
-        <w:t xml:space="preserve">5. Який розв’язок ЗЛП називають оптимальним? </w:t>
+        <w:t xml:space="preserve">5. Який розв'язок ЗЛП називають оптимальним? </w:t>
       </w:r>
       <w:r>
+        <w:rPr>
+          <w:b w:val="0"/>
+        </w:rPr>
         <w:t>План виробництва з області допустимих розв'язків, який надає цільовій функції екстремальне (найбільше або найменше) значення.</w:t>
       </w:r>
     </w:p>
@@ -1864,11 +1934,14 @@
       </w:pPr>
       <w:r>
         <w:rPr>
-          <w:b/>
+          <w:b w:val="0"/>
         </w:rPr>
         <w:t xml:space="preserve">6. Надайте геометричну інтерпретацію ЗЛП. </w:t>
       </w:r>
       <w:r>
+        <w:rPr>
+          <w:b w:val="0"/>
+        </w:rPr>
         <w:t>Знаходження точки опуклого багатокутника (ОДР), у якій лінія рівня цільової функції досягає екстремуму в напрямку вектора градієнта.</w:t>
       </w:r>
     </w:p>
@@ -1880,11 +1953,14 @@
       </w:pPr>
       <w:r>
         <w:rPr>
-          <w:b/>
+          <w:b w:val="0"/>
         </w:rPr>
-        <w:t xml:space="preserve">7. Яка точка допустимої множини розв’язку називається кутовою? </w:t>
+        <w:t xml:space="preserve">7. Яка точка допустимої множини розв'язку називається кутовою? </w:t>
       </w:r>
       <w:r>
+        <w:rPr>
+          <w:b w:val="0"/>
+        </w:rPr>
         <w:t>Вершина багатокутника допустимих розв'язків, яка не може бути виражена як опукла комбінація двох інших точок цієї множини.</w:t>
       </w:r>
     </w:p>
@@ -1896,12 +1972,15 @@
       </w:pPr>
       <w:r>
         <w:rPr>
-          <w:b/>
+          <w:b w:val="0"/>
         </w:rPr>
-        <w:t xml:space="preserve">8. Поясніть алгоритм графічного методу розв’язання ЗЛП. </w:t>
+        <w:t xml:space="preserve">8. Поясніть алгоритм графічного методу розв'язання ЗЛП. </w:t>
       </w:r>
       <w:r>
-        <w:t>Побудова прямих обмежень → побудова ОДР → обчислення градієнта c⃗ → переміщення перпендикулярної лінії рівня до крайньої точки ОДР → знаходження координат оптимуму.</w:t>
+        <w:rPr>
+          <w:b w:val="0"/>
+        </w:rPr>
+        <w:t>Побудова прямих обмежень -&gt; побудова ОДР -&gt; обчислення градієнта c -&gt; переміщення перпендикулярної лінії рівня до крайньої точки ОДР -&gt; знаходження координат оптимуму.</w:t>
       </w:r>
     </w:p>
     <w:p>
@@ -1912,8 +1991,8 @@
       </w:pPr>
       <w:r>
         <w:rPr>
-          <w:b/>
-          <w:sz w:val="32"/>
+          <w:b w:val="0"/>
+          <w:sz w:val="28"/>
         </w:rPr>
         <w:t>Висновки</w:t>
       </w:r>
@@ -1925,6 +2004,9 @@
         <w:jc w:val="both"/>
       </w:pPr>
       <w:r>
+        <w:rPr>
+          <w:b w:val="0"/>
+        </w:rPr>
         <w:t>1. У процесі виконання роботи опановано методику побудови економіко-математичних моделей та їх розв'язання графічним методом.</w:t>
       </w:r>
     </w:p>
@@ -1935,7 +2017,10 @@
         <w:jc w:val="both"/>
       </w:pPr>
       <w:r>
-        <w:t>2. За індивідуальними даними Варіанта 4 (N=4, k=1) складено модель максимізації прибутку: W = 4 x1 + 4.8 x2 → max при обмеженнях на сировину (1700 од.) та машинний час (1600 год.).</w:t>
+        <w:rPr>
+          <w:b w:val="0"/>
+        </w:rPr>
+        <w:t>2. За індивідуальними даними Варіанта 4 (N = 4, k = 0.5) складено модель максимізації прибутку: W = 2.0 x1 + 2.4 x2 -&gt; max при обмеженнях на сировину (1700 од.) та машинний час (1600 год.).</w:t>
       </w:r>
     </w:p>
     <w:p>
@@ -1945,7 +2030,10 @@
         <w:jc w:val="both"/>
       </w:pPr>
       <w:r>
-        <w:t>3. Графічним методом знайдено вершину ОДР B(287.50; 281.25), що забезпечує глобальний максимум прибутку 2500.00 грн при 100% завантаженні сировини та обладнання.</w:t>
+        <w:rPr>
+          <w:b w:val="0"/>
+        </w:rPr>
+        <w:t>3. Графічним методом знайдено вершину ОДР B(161.54; 384.62), що забезпечує глобальний максимум прибутку 1246.15 грн при повному завантаженні сировини та обладнання.</w:t>
       </w:r>
     </w:p>
     <w:p>
@@ -1955,7 +2043,10 @@
         <w:jc w:val="both"/>
       </w:pPr>
       <w:r>
-        <w:t>4. Сформовано практичний цілочисельний план випуску: 286 столів моделі А та 282 столи моделі В, що дає 2497.60 грн чистого прибутку при нульовому залишку сировини.</w:t>
+        <w:rPr>
+          <w:b w:val="0"/>
+        </w:rPr>
+        <w:t>4. Сформовано практичний цілочисельний план випуску: 160 столів моделі А та 385 столів моделі В, що дає 1244.00 грн чистого прибутку при нульовому залишку сировини та залишку 12.0 год. машинного часу.</w:t>
       </w:r>
     </w:p>
     <w:p>
@@ -1965,6 +2056,9 @@
         <w:jc w:val="both"/>
       </w:pPr>
       <w:r>
+        <w:rPr>
+          <w:b w:val="0"/>
+        </w:rPr>
         <w:t>5. Числові та графічні розрахунки верифіковано в середовищі Python за допомогою бібліотек NumPy та SciPy (метод HiGHS).</w:t>
       </w:r>
     </w:p>
@@ -2346,6 +2440,7 @@
     </w:pPr>
     <w:rPr>
       <w:rFonts w:ascii="Times New Roman" w:hAnsi="Times New Roman"/>
+      <w:b w:val="0"/>
       <w:color w:val="000000"/>
       <w:sz w:val="28"/>
     </w:rPr>

</xml_diff>